<commit_message>
docs: add System Design Diagrams (Section 13) to the supervisor .docx
Added 10 project-accurate SE diagrams (rendered from PlantUML via Kroki,
sources + PNGs under docs/diagrams/) and embedded them in the documentation:
use case, block, system architecture, two sequence diagrams (plan a trip,
verify document), activity (document verification), two class diagrams
(identity/travel/documents and billing/locations/AI), ER, and deployment.

Co-Authored-By: Claude Opus 4.8 <noreply@anthropic.com>
</commit_message>
<xml_diff>
--- a/docs/Journey_Junction_Project_Documentation.docx
+++ b/docs/Journey_Junction_Project_Documentation.docx
@@ -1019,6 +1019,258 @@
             <w:r>
               <w:fldChar w:fldCharType="begin" w:dirty="true"/>
               <w:instrText xml:space="preserve">PAGEREF _Toc36 \h</w:instrText>
+              <w:fldChar w:fldCharType="separate"/>
+              <w:fldChar w:fldCharType="end"/>
+            </w:r>
+          </w:hyperlink>
+        </w:p>
+        <w:p>
+          <w:pPr>
+            <w:pStyle w:val="TOC1"/>
+            <w:tabs>
+              <w:tab w:val="right" w:pos="9706" w:leader="dot"/>
+            </w:tabs>
+          </w:pPr>
+          <w:hyperlink w:history="1" w:anchor="_Toc37">
+            <w:r>
+              <w:t xml:space="preserve">13. System Design Diagrams</w:t>
+            </w:r>
+            <w:r>
+              <w:tab/>
+            </w:r>
+            <w:r>
+              <w:fldChar w:fldCharType="begin" w:dirty="true"/>
+              <w:instrText xml:space="preserve">PAGEREF _Toc37 \h</w:instrText>
+              <w:fldChar w:fldCharType="separate"/>
+              <w:fldChar w:fldCharType="end"/>
+            </w:r>
+          </w:hyperlink>
+        </w:p>
+        <w:p>
+          <w:pPr>
+            <w:pStyle w:val="TOC2"/>
+            <w:tabs>
+              <w:tab w:val="right" w:pos="9706" w:leader="dot"/>
+            </w:tabs>
+            <w:ind w:left="220"/>
+          </w:pPr>
+          <w:hyperlink w:history="1" w:anchor="_Toc38">
+            <w:r>
+              <w:t xml:space="preserve">13.1 Use Case Diagram</w:t>
+            </w:r>
+            <w:r>
+              <w:tab/>
+            </w:r>
+            <w:r>
+              <w:fldChar w:fldCharType="begin" w:dirty="true"/>
+              <w:instrText xml:space="preserve">PAGEREF _Toc38 \h</w:instrText>
+              <w:fldChar w:fldCharType="separate"/>
+              <w:fldChar w:fldCharType="end"/>
+            </w:r>
+          </w:hyperlink>
+        </w:p>
+        <w:p>
+          <w:pPr>
+            <w:pStyle w:val="TOC2"/>
+            <w:tabs>
+              <w:tab w:val="right" w:pos="9706" w:leader="dot"/>
+            </w:tabs>
+            <w:ind w:left="220"/>
+          </w:pPr>
+          <w:hyperlink w:history="1" w:anchor="_Toc39">
+            <w:r>
+              <w:t xml:space="preserve">13.2 Block Diagram</w:t>
+            </w:r>
+            <w:r>
+              <w:tab/>
+            </w:r>
+            <w:r>
+              <w:fldChar w:fldCharType="begin" w:dirty="true"/>
+              <w:instrText xml:space="preserve">PAGEREF _Toc39 \h</w:instrText>
+              <w:fldChar w:fldCharType="separate"/>
+              <w:fldChar w:fldCharType="end"/>
+            </w:r>
+          </w:hyperlink>
+        </w:p>
+        <w:p>
+          <w:pPr>
+            <w:pStyle w:val="TOC2"/>
+            <w:tabs>
+              <w:tab w:val="right" w:pos="9706" w:leader="dot"/>
+            </w:tabs>
+            <w:ind w:left="220"/>
+          </w:pPr>
+          <w:hyperlink w:history="1" w:anchor="_Toc40">
+            <w:r>
+              <w:t xml:space="preserve">13.3 System Architecture Diagram</w:t>
+            </w:r>
+            <w:r>
+              <w:tab/>
+            </w:r>
+            <w:r>
+              <w:fldChar w:fldCharType="begin" w:dirty="true"/>
+              <w:instrText xml:space="preserve">PAGEREF _Toc40 \h</w:instrText>
+              <w:fldChar w:fldCharType="separate"/>
+              <w:fldChar w:fldCharType="end"/>
+            </w:r>
+          </w:hyperlink>
+        </w:p>
+        <w:p>
+          <w:pPr>
+            <w:pStyle w:val="TOC2"/>
+            <w:tabs>
+              <w:tab w:val="right" w:pos="9706" w:leader="dot"/>
+            </w:tabs>
+            <w:ind w:left="220"/>
+          </w:pPr>
+          <w:hyperlink w:history="1" w:anchor="_Toc41">
+            <w:r>
+              <w:t xml:space="preserve">13.4 Sequence Diagram — Plan a Trip</w:t>
+            </w:r>
+            <w:r>
+              <w:tab/>
+            </w:r>
+            <w:r>
+              <w:fldChar w:fldCharType="begin" w:dirty="true"/>
+              <w:instrText xml:space="preserve">PAGEREF _Toc41 \h</w:instrText>
+              <w:fldChar w:fldCharType="separate"/>
+              <w:fldChar w:fldCharType="end"/>
+            </w:r>
+          </w:hyperlink>
+        </w:p>
+        <w:p>
+          <w:pPr>
+            <w:pStyle w:val="TOC2"/>
+            <w:tabs>
+              <w:tab w:val="right" w:pos="9706" w:leader="dot"/>
+            </w:tabs>
+            <w:ind w:left="220"/>
+          </w:pPr>
+          <w:hyperlink w:history="1" w:anchor="_Toc42">
+            <w:r>
+              <w:t xml:space="preserve">13.5 Sequence Diagram — Verify Document</w:t>
+            </w:r>
+            <w:r>
+              <w:tab/>
+            </w:r>
+            <w:r>
+              <w:fldChar w:fldCharType="begin" w:dirty="true"/>
+              <w:instrText xml:space="preserve">PAGEREF _Toc42 \h</w:instrText>
+              <w:fldChar w:fldCharType="separate"/>
+              <w:fldChar w:fldCharType="end"/>
+            </w:r>
+          </w:hyperlink>
+        </w:p>
+        <w:p>
+          <w:pPr>
+            <w:pStyle w:val="TOC2"/>
+            <w:tabs>
+              <w:tab w:val="right" w:pos="9706" w:leader="dot"/>
+            </w:tabs>
+            <w:ind w:left="220"/>
+          </w:pPr>
+          <w:hyperlink w:history="1" w:anchor="_Toc43">
+            <w:r>
+              <w:t xml:space="preserve">13.6 Activity Diagram — Document Verification</w:t>
+            </w:r>
+            <w:r>
+              <w:tab/>
+            </w:r>
+            <w:r>
+              <w:fldChar w:fldCharType="begin" w:dirty="true"/>
+              <w:instrText xml:space="preserve">PAGEREF _Toc43 \h</w:instrText>
+              <w:fldChar w:fldCharType="separate"/>
+              <w:fldChar w:fldCharType="end"/>
+            </w:r>
+          </w:hyperlink>
+        </w:p>
+        <w:p>
+          <w:pPr>
+            <w:pStyle w:val="TOC2"/>
+            <w:tabs>
+              <w:tab w:val="right" w:pos="9706" w:leader="dot"/>
+            </w:tabs>
+            <w:ind w:left="220"/>
+          </w:pPr>
+          <w:hyperlink w:history="1" w:anchor="_Toc44">
+            <w:r>
+              <w:t xml:space="preserve">13.7 Class Diagram — Identity, Travel &amp; Documents</w:t>
+            </w:r>
+            <w:r>
+              <w:tab/>
+            </w:r>
+            <w:r>
+              <w:fldChar w:fldCharType="begin" w:dirty="true"/>
+              <w:instrText xml:space="preserve">PAGEREF _Toc44 \h</w:instrText>
+              <w:fldChar w:fldCharType="separate"/>
+              <w:fldChar w:fldCharType="end"/>
+            </w:r>
+          </w:hyperlink>
+        </w:p>
+        <w:p>
+          <w:pPr>
+            <w:pStyle w:val="TOC2"/>
+            <w:tabs>
+              <w:tab w:val="right" w:pos="9706" w:leader="dot"/>
+            </w:tabs>
+            <w:ind w:left="220"/>
+          </w:pPr>
+          <w:hyperlink w:history="1" w:anchor="_Toc45">
+            <w:r>
+              <w:t xml:space="preserve">13.8 Class Diagram — Billing, Locations &amp; AI</w:t>
+            </w:r>
+            <w:r>
+              <w:tab/>
+            </w:r>
+            <w:r>
+              <w:fldChar w:fldCharType="begin" w:dirty="true"/>
+              <w:instrText xml:space="preserve">PAGEREF _Toc45 \h</w:instrText>
+              <w:fldChar w:fldCharType="separate"/>
+              <w:fldChar w:fldCharType="end"/>
+            </w:r>
+          </w:hyperlink>
+        </w:p>
+        <w:p>
+          <w:pPr>
+            <w:pStyle w:val="TOC2"/>
+            <w:tabs>
+              <w:tab w:val="right" w:pos="9706" w:leader="dot"/>
+            </w:tabs>
+            <w:ind w:left="220"/>
+          </w:pPr>
+          <w:hyperlink w:history="1" w:anchor="_Toc46">
+            <w:r>
+              <w:t xml:space="preserve">13.9 Entity-Relationship (ER) Diagram</w:t>
+            </w:r>
+            <w:r>
+              <w:tab/>
+            </w:r>
+            <w:r>
+              <w:fldChar w:fldCharType="begin" w:dirty="true"/>
+              <w:instrText xml:space="preserve">PAGEREF _Toc46 \h</w:instrText>
+              <w:fldChar w:fldCharType="separate"/>
+              <w:fldChar w:fldCharType="end"/>
+            </w:r>
+          </w:hyperlink>
+        </w:p>
+        <w:p>
+          <w:pPr>
+            <w:pStyle w:val="TOC2"/>
+            <w:tabs>
+              <w:tab w:val="right" w:pos="9706" w:leader="dot"/>
+            </w:tabs>
+            <w:ind w:left="220"/>
+          </w:pPr>
+          <w:hyperlink w:history="1" w:anchor="_Toc47">
+            <w:r>
+              <w:t xml:space="preserve">13.10 Deployment Diagram</w:t>
+            </w:r>
+            <w:r>
+              <w:tab/>
+            </w:r>
+            <w:r>
+              <w:fldChar w:fldCharType="begin" w:dirty="true"/>
+              <w:instrText xml:space="preserve">PAGEREF _Toc47 \h</w:instrText>
               <w:fldChar w:fldCharType="separate"/>
               <w:fldChar w:fldCharType="end"/>
             </w:r>
@@ -3336,6 +3588,793 @@
       </w:pPr>
       <w:r>
         <w:t xml:space="preserve">Future work includes a permanent cloud deployment (Render + Vercel), approved custom WhatsApp message templates, expansion to additional markets and languages, deeper personalisation, and native mobile applications.</w:t>
+      </w:r>
+    </w:p>
+    <w:p>
+      <w:r>
+        <w:br w:type="page"/>
+      </w:r>
+    </w:p>
+    <w:p>
+      <w:pPr>
+        <w:pStyle w:val="Heading1"/>
+        <w:spacing w:after="120" w:before="280"/>
+      </w:pPr>
+      <w:bookmarkStart w:name="_Toc37" w:id="37"/>
+      <w:r>
+        <w:rPr>
+          <w:color w:val="16255C"/>
+        </w:rPr>
+        <w:t xml:space="preserve">13. System Design Diagrams</w:t>
+      </w:r>
+      <w:bookmarkEnd w:id="37"/>
+    </w:p>
+    <w:p>
+      <w:pPr>
+        <w:spacing w:after="120" w:line="276"/>
+      </w:pPr>
+      <w:r>
+        <w:t xml:space="preserve">This section presents the software-engineering design diagrams for Journey Junction. They model the system's actors and functions, structure, behaviour, data and deployment, and reflect the implemented application.</w:t>
+      </w:r>
+    </w:p>
+    <w:p>
+      <w:pPr>
+        <w:pStyle w:val="Heading2"/>
+        <w:spacing w:after="60" w:before="200"/>
+      </w:pPr>
+      <w:bookmarkStart w:name="_Toc38" w:id="38"/>
+      <w:r>
+        <w:rPr>
+          <w:color w:val="137E8C"/>
+        </w:rPr>
+        <w:t xml:space="preserve">13.1 Use Case Diagram</w:t>
+      </w:r>
+      <w:bookmarkEnd w:id="38"/>
+    </w:p>
+    <w:p>
+      <w:pPr>
+        <w:spacing w:after="20" w:before="40"/>
+        <w:jc w:val="center"/>
+      </w:pPr>
+      <w:r>
+        <w:drawing>
+          <wp:inline distT="0" distB="0" distL="0" distR="0">
+            <wp:extent cx="5715000" cy="7858125"/>
+            <wp:effectExtent t="0" r="0" b="0" l="0"/>
+            <wp:docPr id="1" name="" descr="" title=""/>
+            <wp:cNvGraphicFramePr>
+              <a:graphicFrameLocks xmlns:a="http://schemas.openxmlformats.org/drawingml/2006/main" noChangeAspect="1"/>
+            </wp:cNvGraphicFramePr>
+            <a:graphic xmlns:a="http://schemas.openxmlformats.org/drawingml/2006/main">
+              <a:graphicData uri="http://schemas.openxmlformats.org/drawingml/2006/picture">
+                <pic:pic xmlns:pic="http://schemas.openxmlformats.org/drawingml/2006/picture">
+                  <pic:nvPicPr>
+                    <pic:cNvPr id="0" name="" descr=""/>
+                    <pic:cNvPicPr>
+                      <a:picLocks noChangeAspect="1" noChangeArrowheads="1"/>
+                    </pic:cNvPicPr>
+                  </pic:nvPicPr>
+                  <pic:blipFill>
+                    <a:blip r:embed="rId7" cstate="none"/>
+                    <a:srcRect/>
+                    <a:stretch>
+                      <a:fillRect/>
+                    </a:stretch>
+                  </pic:blipFill>
+                  <pic:spPr bwMode="auto">
+                    <a:xfrm>
+                      <a:off x="0" y="0"/>
+                      <a:ext cx="5715000" cy="7858125"/>
+                    </a:xfrm>
+                    <a:prstGeom prst="rect">
+                      <a:avLst/>
+                    </a:prstGeom>
+                  </pic:spPr>
+                </pic:pic>
+              </a:graphicData>
+            </a:graphic>
+          </wp:inline>
+        </w:drawing>
+      </w:r>
+    </w:p>
+    <w:p>
+      <w:pPr>
+        <w:spacing w:after="160"/>
+        <w:jc w:val="center"/>
+      </w:pPr>
+      <w:r>
+        <w:rPr>
+          <w:i/>
+          <w:iCs/>
+          <w:color w:val="556070"/>
+          <w:sz w:val="18"/>
+          <w:szCs w:val="18"/>
+        </w:rPr>
+        <w:t xml:space="preserve">Figure 13.1 — Actors (Traveller, Support, Admin, Super Admin, and external services) and the system's use cases.</w:t>
+      </w:r>
+    </w:p>
+    <w:p>
+      <w:pPr>
+        <w:pStyle w:val="Heading2"/>
+        <w:spacing w:after="60" w:before="200"/>
+      </w:pPr>
+      <w:bookmarkStart w:name="_Toc39" w:id="39"/>
+      <w:r>
+        <w:rPr>
+          <w:color w:val="137E8C"/>
+        </w:rPr>
+        <w:t xml:space="preserve">13.2 Block Diagram</w:t>
+      </w:r>
+      <w:bookmarkEnd w:id="39"/>
+    </w:p>
+    <w:p>
+      <w:pPr>
+        <w:spacing w:after="20" w:before="40"/>
+        <w:jc w:val="center"/>
+      </w:pPr>
+      <w:r>
+        <w:drawing>
+          <wp:inline distT="0" distB="0" distL="0" distR="0">
+            <wp:extent cx="5715000" cy="2705100"/>
+            <wp:effectExtent t="0" r="0" b="0" l="0"/>
+            <wp:docPr id="2" name="" descr="" title=""/>
+            <wp:cNvGraphicFramePr>
+              <a:graphicFrameLocks xmlns:a="http://schemas.openxmlformats.org/drawingml/2006/main" noChangeAspect="1"/>
+            </wp:cNvGraphicFramePr>
+            <a:graphic xmlns:a="http://schemas.openxmlformats.org/drawingml/2006/main">
+              <a:graphicData uri="http://schemas.openxmlformats.org/drawingml/2006/picture">
+                <pic:pic xmlns:pic="http://schemas.openxmlformats.org/drawingml/2006/picture">
+                  <pic:nvPicPr>
+                    <pic:cNvPr id="0" name="" descr=""/>
+                    <pic:cNvPicPr>
+                      <a:picLocks noChangeAspect="1" noChangeArrowheads="1"/>
+                    </pic:cNvPicPr>
+                  </pic:nvPicPr>
+                  <pic:blipFill>
+                    <a:blip r:embed="rId8" cstate="none"/>
+                    <a:srcRect/>
+                    <a:stretch>
+                      <a:fillRect/>
+                    </a:stretch>
+                  </pic:blipFill>
+                  <pic:spPr bwMode="auto">
+                    <a:xfrm>
+                      <a:off x="0" y="0"/>
+                      <a:ext cx="5715000" cy="2705100"/>
+                    </a:xfrm>
+                    <a:prstGeom prst="rect">
+                      <a:avLst/>
+                    </a:prstGeom>
+                  </pic:spPr>
+                </pic:pic>
+              </a:graphicData>
+            </a:graphic>
+          </wp:inline>
+        </w:drawing>
+      </w:r>
+    </w:p>
+    <w:p>
+      <w:pPr>
+        <w:spacing w:after="160"/>
+        <w:jc w:val="center"/>
+      </w:pPr>
+      <w:r>
+        <w:rPr>
+          <w:i/>
+          <w:iCs/>
+          <w:color w:val="556070"/>
+          <w:sz w:val="18"/>
+          <w:szCs w:val="18"/>
+        </w:rPr>
+        <w:t xml:space="preserve">Figure 13.2 — High-level layered blocks: presentation, application/API, AI services, external integrations and data.</w:t>
+      </w:r>
+    </w:p>
+    <w:p>
+      <w:pPr>
+        <w:pStyle w:val="Heading2"/>
+        <w:spacing w:after="60" w:before="200"/>
+      </w:pPr>
+      <w:bookmarkStart w:name="_Toc40" w:id="40"/>
+      <w:r>
+        <w:rPr>
+          <w:color w:val="137E8C"/>
+        </w:rPr>
+        <w:t xml:space="preserve">13.3 System Architecture Diagram</w:t>
+      </w:r>
+      <w:bookmarkEnd w:id="40"/>
+    </w:p>
+    <w:p>
+      <w:pPr>
+        <w:spacing w:after="20" w:before="40"/>
+        <w:jc w:val="center"/>
+      </w:pPr>
+      <w:r>
+        <w:drawing>
+          <wp:inline distT="0" distB="0" distL="0" distR="0">
+            <wp:extent cx="5715000" cy="1400175"/>
+            <wp:effectExtent t="0" r="0" b="0" l="0"/>
+            <wp:docPr id="3" name="" descr="" title=""/>
+            <wp:cNvGraphicFramePr>
+              <a:graphicFrameLocks xmlns:a="http://schemas.openxmlformats.org/drawingml/2006/main" noChangeAspect="1"/>
+            </wp:cNvGraphicFramePr>
+            <a:graphic xmlns:a="http://schemas.openxmlformats.org/drawingml/2006/main">
+              <a:graphicData uri="http://schemas.openxmlformats.org/drawingml/2006/picture">
+                <pic:pic xmlns:pic="http://schemas.openxmlformats.org/drawingml/2006/picture">
+                  <pic:nvPicPr>
+                    <pic:cNvPr id="0" name="" descr=""/>
+                    <pic:cNvPicPr>
+                      <a:picLocks noChangeAspect="1" noChangeArrowheads="1"/>
+                    </pic:cNvPicPr>
+                  </pic:nvPicPr>
+                  <pic:blipFill>
+                    <a:blip r:embed="rId9" cstate="none"/>
+                    <a:srcRect/>
+                    <a:stretch>
+                      <a:fillRect/>
+                    </a:stretch>
+                  </pic:blipFill>
+                  <pic:spPr bwMode="auto">
+                    <a:xfrm>
+                      <a:off x="0" y="0"/>
+                      <a:ext cx="5715000" cy="1400175"/>
+                    </a:xfrm>
+                    <a:prstGeom prst="rect">
+                      <a:avLst/>
+                    </a:prstGeom>
+                  </pic:spPr>
+                </pic:pic>
+              </a:graphicData>
+            </a:graphic>
+          </wp:inline>
+        </w:drawing>
+      </w:r>
+    </w:p>
+    <w:p>
+      <w:pPr>
+        <w:spacing w:after="160"/>
+        <w:jc w:val="center"/>
+      </w:pPr>
+      <w:r>
+        <w:rPr>
+          <w:i/>
+          <w:iCs/>
+          <w:color w:val="556070"/>
+          <w:sz w:val="18"/>
+          <w:szCs w:val="18"/>
+        </w:rPr>
+        <w:t xml:space="preserve">Figure 13.3 — Frontend, FastAPI backend modules, data stores and external providers.</w:t>
+      </w:r>
+    </w:p>
+    <w:p>
+      <w:pPr>
+        <w:pStyle w:val="Heading2"/>
+        <w:spacing w:after="60" w:before="200"/>
+      </w:pPr>
+      <w:bookmarkStart w:name="_Toc41" w:id="41"/>
+      <w:r>
+        <w:rPr>
+          <w:color w:val="137E8C"/>
+        </w:rPr>
+        <w:t xml:space="preserve">13.4 Sequence Diagram — Plan a Trip</w:t>
+      </w:r>
+      <w:bookmarkEnd w:id="41"/>
+    </w:p>
+    <w:p>
+      <w:pPr>
+        <w:spacing w:after="20" w:before="40"/>
+        <w:jc w:val="center"/>
+      </w:pPr>
+      <w:r>
+        <w:drawing>
+          <wp:inline distT="0" distB="0" distL="0" distR="0">
+            <wp:extent cx="5715000" cy="2133600"/>
+            <wp:effectExtent t="0" r="0" b="0" l="0"/>
+            <wp:docPr id="4" name="" descr="" title=""/>
+            <wp:cNvGraphicFramePr>
+              <a:graphicFrameLocks xmlns:a="http://schemas.openxmlformats.org/drawingml/2006/main" noChangeAspect="1"/>
+            </wp:cNvGraphicFramePr>
+            <a:graphic xmlns:a="http://schemas.openxmlformats.org/drawingml/2006/main">
+              <a:graphicData uri="http://schemas.openxmlformats.org/drawingml/2006/picture">
+                <pic:pic xmlns:pic="http://schemas.openxmlformats.org/drawingml/2006/picture">
+                  <pic:nvPicPr>
+                    <pic:cNvPr id="0" name="" descr=""/>
+                    <pic:cNvPicPr>
+                      <a:picLocks noChangeAspect="1" noChangeArrowheads="1"/>
+                    </pic:cNvPicPr>
+                  </pic:nvPicPr>
+                  <pic:blipFill>
+                    <a:blip r:embed="rId10" cstate="none"/>
+                    <a:srcRect/>
+                    <a:stretch>
+                      <a:fillRect/>
+                    </a:stretch>
+                  </pic:blipFill>
+                  <pic:spPr bwMode="auto">
+                    <a:xfrm>
+                      <a:off x="0" y="0"/>
+                      <a:ext cx="5715000" cy="2133600"/>
+                    </a:xfrm>
+                    <a:prstGeom prst="rect">
+                      <a:avLst/>
+                    </a:prstGeom>
+                  </pic:spPr>
+                </pic:pic>
+              </a:graphicData>
+            </a:graphic>
+          </wp:inline>
+        </w:drawing>
+      </w:r>
+    </w:p>
+    <w:p>
+      <w:pPr>
+        <w:spacing w:after="160"/>
+        <w:jc w:val="center"/>
+      </w:pPr>
+      <w:r>
+        <w:rPr>
+          <w:i/>
+          <w:iCs/>
+          <w:color w:val="556070"/>
+          <w:sz w:val="18"/>
+          <w:szCs w:val="18"/>
+        </w:rPr>
+        <w:t xml:space="preserve">Figure 13.4 — Interaction when a user plans a trip (flights, hotels, requirements).</w:t>
+      </w:r>
+    </w:p>
+    <w:p>
+      <w:pPr>
+        <w:pStyle w:val="Heading2"/>
+        <w:spacing w:after="60" w:before="200"/>
+      </w:pPr>
+      <w:bookmarkStart w:name="_Toc42" w:id="42"/>
+      <w:r>
+        <w:rPr>
+          <w:color w:val="137E8C"/>
+        </w:rPr>
+        <w:t xml:space="preserve">13.5 Sequence Diagram — Verify Document</w:t>
+      </w:r>
+      <w:bookmarkEnd w:id="42"/>
+    </w:p>
+    <w:p>
+      <w:pPr>
+        <w:spacing w:after="20" w:before="40"/>
+        <w:jc w:val="center"/>
+      </w:pPr>
+      <w:r>
+        <w:drawing>
+          <wp:inline distT="0" distB="0" distL="0" distR="0">
+            <wp:extent cx="5715000" cy="2143125"/>
+            <wp:effectExtent t="0" r="0" b="0" l="0"/>
+            <wp:docPr id="5" name="" descr="" title=""/>
+            <wp:cNvGraphicFramePr>
+              <a:graphicFrameLocks xmlns:a="http://schemas.openxmlformats.org/drawingml/2006/main" noChangeAspect="1"/>
+            </wp:cNvGraphicFramePr>
+            <a:graphic xmlns:a="http://schemas.openxmlformats.org/drawingml/2006/main">
+              <a:graphicData uri="http://schemas.openxmlformats.org/drawingml/2006/picture">
+                <pic:pic xmlns:pic="http://schemas.openxmlformats.org/drawingml/2006/picture">
+                  <pic:nvPicPr>
+                    <pic:cNvPr id="0" name="" descr=""/>
+                    <pic:cNvPicPr>
+                      <a:picLocks noChangeAspect="1" noChangeArrowheads="1"/>
+                    </pic:cNvPicPr>
+                  </pic:nvPicPr>
+                  <pic:blipFill>
+                    <a:blip r:embed="rId11" cstate="none"/>
+                    <a:srcRect/>
+                    <a:stretch>
+                      <a:fillRect/>
+                    </a:stretch>
+                  </pic:blipFill>
+                  <pic:spPr bwMode="auto">
+                    <a:xfrm>
+                      <a:off x="0" y="0"/>
+                      <a:ext cx="5715000" cy="2143125"/>
+                    </a:xfrm>
+                    <a:prstGeom prst="rect">
+                      <a:avLst/>
+                    </a:prstGeom>
+                  </pic:spPr>
+                </pic:pic>
+              </a:graphicData>
+            </a:graphic>
+          </wp:inline>
+        </w:drawing>
+      </w:r>
+    </w:p>
+    <w:p>
+      <w:pPr>
+        <w:spacing w:after="160"/>
+        <w:jc w:val="center"/>
+      </w:pPr>
+      <w:r>
+        <w:rPr>
+          <w:i/>
+          <w:iCs/>
+          <w:color w:val="556070"/>
+          <w:sz w:val="18"/>
+          <w:szCs w:val="18"/>
+        </w:rPr>
+        <w:t xml:space="preserve">Figure 13.5 — Interaction for AI document verification (upload, OCR, validation, compliance).</w:t>
+      </w:r>
+    </w:p>
+    <w:p>
+      <w:pPr>
+        <w:pStyle w:val="Heading2"/>
+        <w:spacing w:after="60" w:before="200"/>
+      </w:pPr>
+      <w:bookmarkStart w:name="_Toc43" w:id="43"/>
+      <w:r>
+        <w:rPr>
+          <w:color w:val="137E8C"/>
+        </w:rPr>
+        <w:t xml:space="preserve">13.6 Activity Diagram — Document Verification</w:t>
+      </w:r>
+      <w:bookmarkEnd w:id="43"/>
+    </w:p>
+    <w:p>
+      <w:pPr>
+        <w:spacing w:after="20" w:before="40"/>
+        <w:jc w:val="center"/>
+      </w:pPr>
+      <w:r>
+        <w:drawing>
+          <wp:inline distT="0" distB="0" distL="0" distR="0">
+            <wp:extent cx="4400550" cy="9610725"/>
+            <wp:effectExtent t="0" r="0" b="0" l="0"/>
+            <wp:docPr id="6" name="" descr="" title=""/>
+            <wp:cNvGraphicFramePr>
+              <a:graphicFrameLocks xmlns:a="http://schemas.openxmlformats.org/drawingml/2006/main" noChangeAspect="1"/>
+            </wp:cNvGraphicFramePr>
+            <a:graphic xmlns:a="http://schemas.openxmlformats.org/drawingml/2006/main">
+              <a:graphicData uri="http://schemas.openxmlformats.org/drawingml/2006/picture">
+                <pic:pic xmlns:pic="http://schemas.openxmlformats.org/drawingml/2006/picture">
+                  <pic:nvPicPr>
+                    <pic:cNvPr id="0" name="" descr=""/>
+                    <pic:cNvPicPr>
+                      <a:picLocks noChangeAspect="1" noChangeArrowheads="1"/>
+                    </pic:cNvPicPr>
+                  </pic:nvPicPr>
+                  <pic:blipFill>
+                    <a:blip r:embed="rId12" cstate="none"/>
+                    <a:srcRect/>
+                    <a:stretch>
+                      <a:fillRect/>
+                    </a:stretch>
+                  </pic:blipFill>
+                  <pic:spPr bwMode="auto">
+                    <a:xfrm>
+                      <a:off x="0" y="0"/>
+                      <a:ext cx="4400550" cy="9610725"/>
+                    </a:xfrm>
+                    <a:prstGeom prst="rect">
+                      <a:avLst/>
+                    </a:prstGeom>
+                  </pic:spPr>
+                </pic:pic>
+              </a:graphicData>
+            </a:graphic>
+          </wp:inline>
+        </w:drawing>
+      </w:r>
+    </w:p>
+    <w:p>
+      <w:pPr>
+        <w:spacing w:after="160"/>
+        <w:jc w:val="center"/>
+      </w:pPr>
+      <w:r>
+        <w:rPr>
+          <w:i/>
+          <w:iCs/>
+          <w:color w:val="556070"/>
+          <w:sz w:val="18"/>
+          <w:szCs w:val="18"/>
+        </w:rPr>
+        <w:t xml:space="preserve">Figure 13.6 — Workflow and decisions of the document-verification process.</w:t>
+      </w:r>
+    </w:p>
+    <w:p>
+      <w:pPr>
+        <w:pStyle w:val="Heading2"/>
+        <w:spacing w:after="60" w:before="200"/>
+      </w:pPr>
+      <w:bookmarkStart w:name="_Toc44" w:id="44"/>
+      <w:r>
+        <w:rPr>
+          <w:color w:val="137E8C"/>
+        </w:rPr>
+        <w:t xml:space="preserve">13.7 Class Diagram — Identity, Travel &amp; Documents</w:t>
+      </w:r>
+      <w:bookmarkEnd w:id="44"/>
+    </w:p>
+    <w:p>
+      <w:pPr>
+        <w:spacing w:after="20" w:before="40"/>
+        <w:jc w:val="center"/>
+      </w:pPr>
+      <w:r>
+        <w:drawing>
+          <wp:inline distT="0" distB="0" distL="0" distR="0">
+            <wp:extent cx="3790950" cy="6667500"/>
+            <wp:effectExtent t="0" r="0" b="0" l="0"/>
+            <wp:docPr id="7" name="" descr="" title=""/>
+            <wp:cNvGraphicFramePr>
+              <a:graphicFrameLocks xmlns:a="http://schemas.openxmlformats.org/drawingml/2006/main" noChangeAspect="1"/>
+            </wp:cNvGraphicFramePr>
+            <a:graphic xmlns:a="http://schemas.openxmlformats.org/drawingml/2006/main">
+              <a:graphicData uri="http://schemas.openxmlformats.org/drawingml/2006/picture">
+                <pic:pic xmlns:pic="http://schemas.openxmlformats.org/drawingml/2006/picture">
+                  <pic:nvPicPr>
+                    <pic:cNvPr id="0" name="" descr=""/>
+                    <pic:cNvPicPr>
+                      <a:picLocks noChangeAspect="1" noChangeArrowheads="1"/>
+                    </pic:cNvPicPr>
+                  </pic:nvPicPr>
+                  <pic:blipFill>
+                    <a:blip r:embed="rId13" cstate="none"/>
+                    <a:srcRect/>
+                    <a:stretch>
+                      <a:fillRect/>
+                    </a:stretch>
+                  </pic:blipFill>
+                  <pic:spPr bwMode="auto">
+                    <a:xfrm>
+                      <a:off x="0" y="0"/>
+                      <a:ext cx="3790950" cy="6667500"/>
+                    </a:xfrm>
+                    <a:prstGeom prst="rect">
+                      <a:avLst/>
+                    </a:prstGeom>
+                  </pic:spPr>
+                </pic:pic>
+              </a:graphicData>
+            </a:graphic>
+          </wp:inline>
+        </w:drawing>
+      </w:r>
+    </w:p>
+    <w:p>
+      <w:pPr>
+        <w:spacing w:after="160"/>
+        <w:jc w:val="center"/>
+      </w:pPr>
+      <w:r>
+        <w:rPr>
+          <w:i/>
+          <w:iCs/>
+          <w:color w:val="556070"/>
+          <w:sz w:val="18"/>
+          <w:szCs w:val="18"/>
+        </w:rPr>
+        <w:t xml:space="preserve">Figure 13.7 — Core domain classes for users, trips and documents.</w:t>
+      </w:r>
+    </w:p>
+    <w:p>
+      <w:pPr>
+        <w:pStyle w:val="Heading2"/>
+        <w:spacing w:after="60" w:before="200"/>
+      </w:pPr>
+      <w:bookmarkStart w:name="_Toc45" w:id="45"/>
+      <w:r>
+        <w:rPr>
+          <w:color w:val="137E8C"/>
+        </w:rPr>
+        <w:t xml:space="preserve">13.8 Class Diagram — Billing, Locations &amp; AI</w:t>
+      </w:r>
+      <w:bookmarkEnd w:id="45"/>
+    </w:p>
+    <w:p>
+      <w:pPr>
+        <w:spacing w:after="20" w:before="40"/>
+        <w:jc w:val="center"/>
+      </w:pPr>
+      <w:r>
+        <w:drawing>
+          <wp:inline distT="0" distB="0" distL="0" distR="0">
+            <wp:extent cx="5715000" cy="5619750"/>
+            <wp:effectExtent t="0" r="0" b="0" l="0"/>
+            <wp:docPr id="8" name="" descr="" title=""/>
+            <wp:cNvGraphicFramePr>
+              <a:graphicFrameLocks xmlns:a="http://schemas.openxmlformats.org/drawingml/2006/main" noChangeAspect="1"/>
+            </wp:cNvGraphicFramePr>
+            <a:graphic xmlns:a="http://schemas.openxmlformats.org/drawingml/2006/main">
+              <a:graphicData uri="http://schemas.openxmlformats.org/drawingml/2006/picture">
+                <pic:pic xmlns:pic="http://schemas.openxmlformats.org/drawingml/2006/picture">
+                  <pic:nvPicPr>
+                    <pic:cNvPr id="0" name="" descr=""/>
+                    <pic:cNvPicPr>
+                      <a:picLocks noChangeAspect="1" noChangeArrowheads="1"/>
+                    </pic:cNvPicPr>
+                  </pic:nvPicPr>
+                  <pic:blipFill>
+                    <a:blip r:embed="rId14" cstate="none"/>
+                    <a:srcRect/>
+                    <a:stretch>
+                      <a:fillRect/>
+                    </a:stretch>
+                  </pic:blipFill>
+                  <pic:spPr bwMode="auto">
+                    <a:xfrm>
+                      <a:off x="0" y="0"/>
+                      <a:ext cx="5715000" cy="5619750"/>
+                    </a:xfrm>
+                    <a:prstGeom prst="rect">
+                      <a:avLst/>
+                    </a:prstGeom>
+                  </pic:spPr>
+                </pic:pic>
+              </a:graphicData>
+            </a:graphic>
+          </wp:inline>
+        </w:drawing>
+      </w:r>
+    </w:p>
+    <w:p>
+      <w:pPr>
+        <w:spacing w:after="160"/>
+        <w:jc w:val="center"/>
+      </w:pPr>
+      <w:r>
+        <w:rPr>
+          <w:i/>
+          <w:iCs/>
+          <w:color w:val="556070"/>
+          <w:sz w:val="18"/>
+          <w:szCs w:val="18"/>
+        </w:rPr>
+        <w:t xml:space="preserve">Figure 13.8 — Classes for subscriptions, requirements and the AI assistant.</w:t>
+      </w:r>
+    </w:p>
+    <w:p>
+      <w:pPr>
+        <w:pStyle w:val="Heading2"/>
+        <w:spacing w:after="60" w:before="200"/>
+      </w:pPr>
+      <w:bookmarkStart w:name="_Toc46" w:id="46"/>
+      <w:r>
+        <w:rPr>
+          <w:color w:val="137E8C"/>
+        </w:rPr>
+        <w:t xml:space="preserve">13.9 Entity-Relationship (ER) Diagram</w:t>
+      </w:r>
+      <w:bookmarkEnd w:id="46"/>
+    </w:p>
+    <w:p>
+      <w:pPr>
+        <w:spacing w:after="20" w:before="40"/>
+        <w:jc w:val="center"/>
+      </w:pPr>
+      <w:r>
+        <w:drawing>
+          <wp:inline distT="0" distB="0" distL="0" distR="0">
+            <wp:extent cx="5715000" cy="3228975"/>
+            <wp:effectExtent t="0" r="0" b="0" l="0"/>
+            <wp:docPr id="9" name="" descr="" title=""/>
+            <wp:cNvGraphicFramePr>
+              <a:graphicFrameLocks xmlns:a="http://schemas.openxmlformats.org/drawingml/2006/main" noChangeAspect="1"/>
+            </wp:cNvGraphicFramePr>
+            <a:graphic xmlns:a="http://schemas.openxmlformats.org/drawingml/2006/main">
+              <a:graphicData uri="http://schemas.openxmlformats.org/drawingml/2006/picture">
+                <pic:pic xmlns:pic="http://schemas.openxmlformats.org/drawingml/2006/picture">
+                  <pic:nvPicPr>
+                    <pic:cNvPr id="0" name="" descr=""/>
+                    <pic:cNvPicPr>
+                      <a:picLocks noChangeAspect="1" noChangeArrowheads="1"/>
+                    </pic:cNvPicPr>
+                  </pic:nvPicPr>
+                  <pic:blipFill>
+                    <a:blip r:embed="rId15" cstate="none"/>
+                    <a:srcRect/>
+                    <a:stretch>
+                      <a:fillRect/>
+                    </a:stretch>
+                  </pic:blipFill>
+                  <pic:spPr bwMode="auto">
+                    <a:xfrm>
+                      <a:off x="0" y="0"/>
+                      <a:ext cx="5715000" cy="3228975"/>
+                    </a:xfrm>
+                    <a:prstGeom prst="rect">
+                      <a:avLst/>
+                    </a:prstGeom>
+                  </pic:spPr>
+                </pic:pic>
+              </a:graphicData>
+            </a:graphic>
+          </wp:inline>
+        </w:drawing>
+      </w:r>
+    </w:p>
+    <w:p>
+      <w:pPr>
+        <w:spacing w:after="160"/>
+        <w:jc w:val="center"/>
+      </w:pPr>
+      <w:r>
+        <w:rPr>
+          <w:i/>
+          <w:iCs/>
+          <w:color w:val="556070"/>
+          <w:sz w:val="18"/>
+          <w:szCs w:val="18"/>
+        </w:rPr>
+        <w:t xml:space="preserve">Figure 13.9 — Database entities and their relationships.</w:t>
+      </w:r>
+    </w:p>
+    <w:p>
+      <w:pPr>
+        <w:pStyle w:val="Heading2"/>
+        <w:spacing w:after="60" w:before="200"/>
+      </w:pPr>
+      <w:bookmarkStart w:name="_Toc47" w:id="47"/>
+      <w:r>
+        <w:rPr>
+          <w:color w:val="137E8C"/>
+        </w:rPr>
+        <w:t xml:space="preserve">13.10 Deployment Diagram</w:t>
+      </w:r>
+      <w:bookmarkEnd w:id="47"/>
+    </w:p>
+    <w:p>
+      <w:pPr>
+        <w:spacing w:after="20" w:before="40"/>
+        <w:jc w:val="center"/>
+      </w:pPr>
+      <w:r>
+        <w:drawing>
+          <wp:inline distT="0" distB="0" distL="0" distR="0">
+            <wp:extent cx="5715000" cy="2962275"/>
+            <wp:effectExtent t="0" r="0" b="0" l="0"/>
+            <wp:docPr id="10" name="" descr="" title=""/>
+            <wp:cNvGraphicFramePr>
+              <a:graphicFrameLocks xmlns:a="http://schemas.openxmlformats.org/drawingml/2006/main" noChangeAspect="1"/>
+            </wp:cNvGraphicFramePr>
+            <a:graphic xmlns:a="http://schemas.openxmlformats.org/drawingml/2006/main">
+              <a:graphicData uri="http://schemas.openxmlformats.org/drawingml/2006/picture">
+                <pic:pic xmlns:pic="http://schemas.openxmlformats.org/drawingml/2006/picture">
+                  <pic:nvPicPr>
+                    <pic:cNvPr id="0" name="" descr=""/>
+                    <pic:cNvPicPr>
+                      <a:picLocks noChangeAspect="1" noChangeArrowheads="1"/>
+                    </pic:cNvPicPr>
+                  </pic:nvPicPr>
+                  <pic:blipFill>
+                    <a:blip r:embed="rId16" cstate="none"/>
+                    <a:srcRect/>
+                    <a:stretch>
+                      <a:fillRect/>
+                    </a:stretch>
+                  </pic:blipFill>
+                  <pic:spPr bwMode="auto">
+                    <a:xfrm>
+                      <a:off x="0" y="0"/>
+                      <a:ext cx="5715000" cy="2962275"/>
+                    </a:xfrm>
+                    <a:prstGeom prst="rect">
+                      <a:avLst/>
+                    </a:prstGeom>
+                  </pic:spPr>
+                </pic:pic>
+              </a:graphicData>
+            </a:graphic>
+          </wp:inline>
+        </w:drawing>
+      </w:r>
+    </w:p>
+    <w:p>
+      <w:pPr>
+        <w:spacing w:after="160"/>
+        <w:jc w:val="center"/>
+      </w:pPr>
+      <w:r>
+        <w:rPr>
+          <w:i/>
+          <w:iCs/>
+          <w:color w:val="556070"/>
+          <w:sz w:val="18"/>
+          <w:szCs w:val="18"/>
+        </w:rPr>
+        <w:t xml:space="preserve">Figure 13.10 — Runtime nodes: browser, Vercel frontend, Render backend + Postgres + Redis, and external APIs.</w:t>
       </w:r>
     </w:p>
     <w:sectPr>

</xml_diff>